<commit_message>
Toda lengua y toda nación
</commit_message>
<xml_diff>
--- a/Work/Toda lengua y toda nación Toma tu Lugar.docx
+++ b/Work/Toda lengua y toda nación Toma tu Lugar.docx
@@ -338,51 +338,202 @@
           <w:sz w:val="28"/>
           <w:szCs w:val="24"/>
         </w:rPr>
-        <w:t>Pre</w:t>
-      </w:r>
-      <w:r>
-        <w:rPr>
-          <w:b/>
-          <w:bCs/>
+        <w:t>Pre Coro</w:t>
+      </w:r>
+    </w:p>
+    <w:p>
+      <w:pPr>
+        <w:spacing w:after="0"/>
+        <w:rPr>
+          <w:sz w:val="28"/>
+          <w:szCs w:val="24"/>
+        </w:rPr>
+      </w:pPr>
+      <w:r>
+        <w:rPr>
+          <w:sz w:val="28"/>
+          <w:szCs w:val="24"/>
+        </w:rPr>
+        <w:t xml:space="preserve">   </w:t>
+      </w:r>
+      <w:r>
+        <w:rPr>
+          <w:sz w:val="28"/>
+          <w:szCs w:val="24"/>
+        </w:rPr>
+        <w:t>F#m</w:t>
+      </w:r>
+      <w:r>
+        <w:rPr>
+          <w:sz w:val="28"/>
+          <w:szCs w:val="24"/>
+        </w:rPr>
+        <w:t xml:space="preserve">                                    E</w:t>
+      </w:r>
+      <w:r>
+        <w:rPr>
+          <w:sz w:val="28"/>
+          <w:szCs w:val="24"/>
+        </w:rPr>
+        <w:t>/</w:t>
+      </w:r>
+      <w:r>
+        <w:rPr>
+          <w:sz w:val="28"/>
+          <w:szCs w:val="24"/>
+        </w:rPr>
+        <w:t>G#</w:t>
+      </w:r>
+      <w:r>
+        <w:rPr>
+          <w:sz w:val="28"/>
+          <w:szCs w:val="24"/>
+        </w:rPr>
+        <w:t xml:space="preserve">         </w:t>
+      </w:r>
+    </w:p>
+    <w:p>
+      <w:pPr>
+        <w:spacing w:after="0"/>
+        <w:rPr>
+          <w:sz w:val="28"/>
+          <w:szCs w:val="24"/>
+        </w:rPr>
+      </w:pPr>
+      <w:r>
+        <w:rPr>
+          <w:sz w:val="28"/>
+          <w:szCs w:val="24"/>
+        </w:rPr>
+        <w:t>Y mientras te esperamos</w:t>
+      </w:r>
+      <w:r>
+        <w:rPr>
+          <w:sz w:val="28"/>
+          <w:szCs w:val="24"/>
+        </w:rPr>
+        <w:t xml:space="preserve">, El fuego no </w:t>
+      </w:r>
+    </w:p>
+    <w:p>
+      <w:pPr>
+        <w:spacing w:after="0"/>
+        <w:rPr>
+          <w:sz w:val="28"/>
+          <w:szCs w:val="24"/>
+        </w:rPr>
+      </w:pPr>
+      <w:r>
+        <w:rPr>
+          <w:sz w:val="28"/>
+          <w:szCs w:val="24"/>
+        </w:rPr>
+        <w:t xml:space="preserve">     </w:t>
+      </w:r>
+      <w:r>
+        <w:rPr>
+          <w:sz w:val="28"/>
+          <w:szCs w:val="24"/>
+        </w:rPr>
+        <w:t>A</w:t>
+      </w:r>
+      <w:r>
+        <w:rPr>
+          <w:sz w:val="28"/>
+          <w:szCs w:val="24"/>
+        </w:rPr>
+        <w:t>/</w:t>
+      </w:r>
+      <w:r>
+        <w:rPr>
+          <w:sz w:val="28"/>
+          <w:szCs w:val="24"/>
+        </w:rPr>
+        <w:t>C#</w:t>
+      </w:r>
+      <w:r>
+        <w:rPr>
+          <w:sz w:val="28"/>
+          <w:szCs w:val="24"/>
+        </w:rPr>
+        <w:t xml:space="preserve">   </w:t>
+      </w:r>
+      <w:r>
+        <w:rPr>
+          <w:sz w:val="28"/>
+          <w:szCs w:val="24"/>
+        </w:rPr>
+        <w:t xml:space="preserve">   </w:t>
+      </w:r>
+      <w:r>
+        <w:rPr>
+          <w:sz w:val="28"/>
+          <w:szCs w:val="24"/>
+        </w:rPr>
+        <w:t>D</w:t>
+      </w:r>
+    </w:p>
+    <w:p>
+      <w:pPr>
+        <w:spacing w:after="0"/>
+        <w:rPr>
+          <w:sz w:val="28"/>
+          <w:szCs w:val="24"/>
+        </w:rPr>
+      </w:pPr>
+      <w:r>
+        <w:rPr>
+          <w:sz w:val="28"/>
+          <w:szCs w:val="24"/>
+        </w:rPr>
+        <w:t xml:space="preserve">se </w:t>
+      </w:r>
+      <w:proofErr w:type="gramStart"/>
+      <w:r>
+        <w:rPr>
+          <w:sz w:val="28"/>
+          <w:szCs w:val="24"/>
+        </w:rPr>
+        <w:t>apagará,</w:t>
+      </w:r>
+      <w:r>
+        <w:rPr>
+          <w:sz w:val="28"/>
+          <w:szCs w:val="24"/>
+        </w:rPr>
+        <w:t xml:space="preserve">  </w:t>
+      </w:r>
+      <w:r>
+        <w:rPr>
           <w:sz w:val="28"/>
           <w:szCs w:val="24"/>
         </w:rPr>
         <w:t xml:space="preserve"> </w:t>
       </w:r>
-      <w:r>
-        <w:rPr>
-          <w:b/>
-          <w:bCs/>
-          <w:sz w:val="28"/>
-          <w:szCs w:val="24"/>
-        </w:rPr>
-        <w:t>C</w:t>
-      </w:r>
-      <w:r>
-        <w:rPr>
-          <w:b/>
-          <w:bCs/>
-          <w:sz w:val="28"/>
-          <w:szCs w:val="24"/>
-        </w:rPr>
-        <w:t>oro</w:t>
-      </w:r>
-    </w:p>
-    <w:p>
-      <w:pPr>
-        <w:spacing w:after="0"/>
-        <w:rPr>
-          <w:sz w:val="28"/>
-          <w:szCs w:val="24"/>
-        </w:rPr>
-      </w:pPr>
-      <w:r>
-        <w:rPr>
-          <w:sz w:val="28"/>
-          <w:szCs w:val="24"/>
-        </w:rPr>
-        <w:t xml:space="preserve">   </w:t>
-      </w:r>
+      <w:proofErr w:type="gramEnd"/>
+      <w:r>
+        <w:rPr>
+          <w:sz w:val="28"/>
+          <w:szCs w:val="24"/>
+        </w:rPr>
+        <w:t xml:space="preserve"> </w:t>
+      </w:r>
+      <w:r>
+        <w:rPr>
+          <w:sz w:val="28"/>
+          <w:szCs w:val="24"/>
+        </w:rPr>
+        <w:t xml:space="preserve"> El fuego no se apagará</w:t>
+      </w:r>
+    </w:p>
+    <w:p>
+      <w:pPr>
+        <w:spacing w:after="0"/>
+        <w:rPr>
+          <w:sz w:val="28"/>
+          <w:szCs w:val="24"/>
+        </w:rPr>
+      </w:pPr>
       <w:r>
         <w:rPr>
           <w:sz w:val="28"/>
@@ -395,61 +546,61 @@
           <w:sz w:val="28"/>
           <w:szCs w:val="24"/>
         </w:rPr>
-        <w:t xml:space="preserve">                                    E</w:t>
-      </w:r>
-      <w:r>
-        <w:rPr>
-          <w:sz w:val="28"/>
-          <w:szCs w:val="24"/>
-        </w:rPr>
-        <w:t>/G#</w:t>
-      </w:r>
-      <w:r>
-        <w:rPr>
-          <w:sz w:val="28"/>
-          <w:szCs w:val="24"/>
-        </w:rPr>
-        <w:t xml:space="preserve">           </w:t>
-      </w:r>
-    </w:p>
-    <w:p>
-      <w:pPr>
-        <w:spacing w:after="0"/>
-        <w:rPr>
-          <w:sz w:val="28"/>
-          <w:szCs w:val="24"/>
-        </w:rPr>
-      </w:pPr>
-      <w:r>
-        <w:rPr>
-          <w:sz w:val="28"/>
-          <w:szCs w:val="24"/>
-        </w:rPr>
-        <w:t>Y mientras te esperamos</w:t>
-      </w:r>
-      <w:r>
-        <w:rPr>
-          <w:sz w:val="28"/>
-          <w:szCs w:val="24"/>
-        </w:rPr>
-        <w:t xml:space="preserve">, El fuego no </w:t>
-      </w:r>
-    </w:p>
-    <w:p>
-      <w:pPr>
-        <w:spacing w:after="0"/>
-        <w:rPr>
-          <w:sz w:val="28"/>
-          <w:szCs w:val="24"/>
-        </w:rPr>
-      </w:pPr>
-      <w:r>
-        <w:rPr>
-          <w:sz w:val="28"/>
-          <w:szCs w:val="24"/>
-        </w:rPr>
-        <w:t xml:space="preserve">     </w:t>
-      </w:r>
+        <w:t xml:space="preserve">                              E</w:t>
+      </w:r>
+      <w:r>
+        <w:rPr>
+          <w:sz w:val="28"/>
+          <w:szCs w:val="24"/>
+        </w:rPr>
+        <w:t>/</w:t>
+      </w:r>
+      <w:r>
+        <w:rPr>
+          <w:sz w:val="28"/>
+          <w:szCs w:val="24"/>
+        </w:rPr>
+        <w:t>G#</w:t>
+      </w:r>
+      <w:r>
+        <w:rPr>
+          <w:sz w:val="28"/>
+          <w:szCs w:val="24"/>
+        </w:rPr>
+        <w:t xml:space="preserve">             </w:t>
+      </w:r>
+    </w:p>
+    <w:p>
+      <w:pPr>
+        <w:spacing w:after="0"/>
+        <w:rPr>
+          <w:sz w:val="28"/>
+          <w:szCs w:val="24"/>
+        </w:rPr>
+      </w:pPr>
+      <w:r>
+        <w:rPr>
+          <w:sz w:val="28"/>
+          <w:szCs w:val="24"/>
+        </w:rPr>
+        <w:t>Ábranse las puertas</w:t>
+      </w:r>
+      <w:r>
+        <w:rPr>
+          <w:sz w:val="28"/>
+          <w:szCs w:val="24"/>
+        </w:rPr>
+        <w:t>, El Rey de gloria</w:t>
+      </w:r>
+    </w:p>
+    <w:p>
+      <w:pPr>
+        <w:spacing w:after="0"/>
+        <w:rPr>
+          <w:sz w:val="28"/>
+          <w:szCs w:val="24"/>
+        </w:rPr>
+      </w:pPr>
       <w:r>
         <w:rPr>
           <w:sz w:val="28"/>
@@ -462,164 +613,83 @@
           <w:sz w:val="28"/>
           <w:szCs w:val="24"/>
         </w:rPr>
-        <w:t>/C#</w:t>
-      </w:r>
-      <w:r>
-        <w:rPr>
-          <w:sz w:val="28"/>
-          <w:szCs w:val="24"/>
-        </w:rPr>
-        <w:t xml:space="preserve">   </w:t>
-      </w:r>
-      <w:r>
-        <w:rPr>
-          <w:sz w:val="28"/>
-          <w:szCs w:val="24"/>
-        </w:rPr>
-        <w:t xml:space="preserve">   </w:t>
-      </w:r>
-      <w:r>
-        <w:rPr>
-          <w:sz w:val="28"/>
-          <w:szCs w:val="24"/>
-        </w:rPr>
-        <w:t>D</w:t>
-      </w:r>
-    </w:p>
-    <w:p>
-      <w:pPr>
-        <w:spacing w:after="0"/>
-        <w:rPr>
-          <w:sz w:val="28"/>
-          <w:szCs w:val="24"/>
-        </w:rPr>
-      </w:pPr>
-      <w:r>
-        <w:rPr>
-          <w:sz w:val="28"/>
-          <w:szCs w:val="24"/>
-        </w:rPr>
-        <w:t>se apagará,</w:t>
-      </w:r>
-      <w:r>
-        <w:rPr>
-          <w:sz w:val="28"/>
-          <w:szCs w:val="24"/>
-        </w:rPr>
-        <w:t xml:space="preserve">  </w:t>
-      </w:r>
-      <w:r>
-        <w:rPr>
-          <w:sz w:val="28"/>
-          <w:szCs w:val="24"/>
-        </w:rPr>
-        <w:t xml:space="preserve"> El fuego no se apagará</w:t>
-      </w:r>
-    </w:p>
-    <w:p>
-      <w:pPr>
-        <w:spacing w:after="0"/>
-        <w:rPr>
-          <w:sz w:val="28"/>
-          <w:szCs w:val="24"/>
-        </w:rPr>
-      </w:pPr>
-      <w:r>
-        <w:rPr>
-          <w:sz w:val="28"/>
-          <w:szCs w:val="24"/>
-        </w:rPr>
-        <w:t>F#m</w:t>
-      </w:r>
-      <w:r>
-        <w:rPr>
-          <w:sz w:val="28"/>
-          <w:szCs w:val="24"/>
-        </w:rPr>
-        <w:t xml:space="preserve">                              E</w:t>
-      </w:r>
-      <w:r>
-        <w:rPr>
-          <w:sz w:val="28"/>
-          <w:szCs w:val="24"/>
-        </w:rPr>
-        <w:t>/G#</w:t>
-      </w:r>
-      <w:r>
-        <w:rPr>
-          <w:sz w:val="28"/>
-          <w:szCs w:val="24"/>
-        </w:rPr>
-        <w:t xml:space="preserve">             </w:t>
-      </w:r>
-    </w:p>
-    <w:p>
-      <w:pPr>
-        <w:spacing w:after="0"/>
-        <w:rPr>
-          <w:sz w:val="28"/>
-          <w:szCs w:val="24"/>
-        </w:rPr>
-      </w:pPr>
-      <w:r>
-        <w:rPr>
-          <w:sz w:val="28"/>
-          <w:szCs w:val="24"/>
-        </w:rPr>
-        <w:t>Ábranse las puertas</w:t>
-      </w:r>
-      <w:r>
-        <w:rPr>
-          <w:sz w:val="28"/>
-          <w:szCs w:val="24"/>
-        </w:rPr>
-        <w:t>, El Rey de gloria</w:t>
-      </w:r>
-    </w:p>
-    <w:p>
-      <w:pPr>
-        <w:spacing w:after="0"/>
-        <w:rPr>
-          <w:sz w:val="28"/>
-          <w:szCs w:val="24"/>
-        </w:rPr>
-      </w:pPr>
-      <w:r>
-        <w:rPr>
-          <w:sz w:val="28"/>
-          <w:szCs w:val="24"/>
-        </w:rPr>
-        <w:t>A</w:t>
-      </w:r>
-      <w:r>
-        <w:rPr>
-          <w:sz w:val="28"/>
-          <w:szCs w:val="24"/>
-        </w:rPr>
-        <w:t>/C#</w:t>
-      </w:r>
-      <w:r>
-        <w:rPr>
-          <w:sz w:val="28"/>
-          <w:szCs w:val="24"/>
-        </w:rPr>
-        <w:t xml:space="preserve">  D        E</w:t>
-      </w:r>
-    </w:p>
-    <w:p>
-      <w:pPr>
-        <w:spacing w:after="0"/>
-        <w:rPr>
-          <w:sz w:val="28"/>
-          <w:szCs w:val="24"/>
-        </w:rPr>
-      </w:pPr>
-      <w:r>
-        <w:rPr>
-          <w:sz w:val="28"/>
-          <w:szCs w:val="24"/>
-        </w:rPr>
-        <w:t>viene ya, y todo ojo le verá</w:t>
+        <w:t>/</w:t>
+      </w:r>
+      <w:proofErr w:type="gramStart"/>
+      <w:r>
+        <w:rPr>
+          <w:sz w:val="28"/>
+          <w:szCs w:val="24"/>
+        </w:rPr>
+        <w:t>C#</w:t>
+      </w:r>
+      <w:r>
+        <w:rPr>
+          <w:sz w:val="28"/>
+          <w:szCs w:val="24"/>
+        </w:rPr>
+        <w:t xml:space="preserve">  D</w:t>
+      </w:r>
+      <w:proofErr w:type="gramEnd"/>
+      <w:r>
+        <w:rPr>
+          <w:sz w:val="28"/>
+          <w:szCs w:val="24"/>
+        </w:rPr>
+        <w:t xml:space="preserve">      </w:t>
+      </w:r>
+      <w:r>
+        <w:rPr>
+          <w:sz w:val="28"/>
+          <w:szCs w:val="24"/>
+        </w:rPr>
+        <w:t xml:space="preserve"> </w:t>
+      </w:r>
+      <w:r>
+        <w:rPr>
+          <w:sz w:val="28"/>
+          <w:szCs w:val="24"/>
+        </w:rPr>
+        <w:t xml:space="preserve">  E</w:t>
+      </w:r>
+    </w:p>
+    <w:p>
+      <w:pPr>
+        <w:spacing w:after="0"/>
+        <w:rPr>
+          <w:sz w:val="28"/>
+          <w:szCs w:val="24"/>
+        </w:rPr>
+      </w:pPr>
+      <w:proofErr w:type="gramStart"/>
+      <w:r>
+        <w:rPr>
+          <w:sz w:val="28"/>
+          <w:szCs w:val="24"/>
+        </w:rPr>
+        <w:t xml:space="preserve">viene </w:t>
+      </w:r>
+      <w:r>
+        <w:rPr>
+          <w:sz w:val="28"/>
+          <w:szCs w:val="24"/>
+        </w:rPr>
+        <w:t xml:space="preserve"> </w:t>
+      </w:r>
+      <w:r>
+        <w:rPr>
+          <w:sz w:val="28"/>
+          <w:szCs w:val="24"/>
+        </w:rPr>
+        <w:t>ya</w:t>
+      </w:r>
+      <w:proofErr w:type="gramEnd"/>
+      <w:r>
+        <w:rPr>
+          <w:sz w:val="28"/>
+          <w:szCs w:val="24"/>
+        </w:rPr>
+        <w:t>, y todo ojo le verá</w:t>
       </w:r>
     </w:p>
     <w:p>
@@ -809,8 +879,317 @@
           <w:sz w:val="28"/>
           <w:szCs w:val="24"/>
         </w:rPr>
-        <w:t xml:space="preserve"> E</w:t>
-      </w:r>
+        <w:t xml:space="preserve"> </w:t>
+      </w:r>
+      <w:r>
+        <w:rPr>
+          <w:sz w:val="28"/>
+          <w:szCs w:val="24"/>
+        </w:rPr>
+        <w:t>E/G#</w:t>
+      </w:r>
+    </w:p>
+    <w:p>
+      <w:pPr>
+        <w:spacing w:after="0"/>
+        <w:rPr>
+          <w:b/>
+          <w:bCs/>
+          <w:sz w:val="28"/>
+          <w:szCs w:val="24"/>
+        </w:rPr>
+      </w:pPr>
+      <w:r>
+        <w:rPr>
+          <w:b/>
+          <w:bCs/>
+          <w:sz w:val="28"/>
+          <w:szCs w:val="24"/>
+        </w:rPr>
+        <w:t>Verso I</w:t>
+      </w:r>
+    </w:p>
+    <w:p>
+      <w:pPr>
+        <w:spacing w:after="0"/>
+        <w:rPr>
+          <w:b/>
+          <w:bCs/>
+          <w:sz w:val="28"/>
+          <w:szCs w:val="24"/>
+        </w:rPr>
+      </w:pPr>
+      <w:r>
+        <w:rPr>
+          <w:b/>
+          <w:bCs/>
+          <w:sz w:val="28"/>
+          <w:szCs w:val="24"/>
+        </w:rPr>
+        <w:t>Verso II</w:t>
+      </w:r>
+    </w:p>
+    <w:p>
+      <w:pPr>
+        <w:spacing w:after="0"/>
+        <w:rPr>
+          <w:b/>
+          <w:bCs/>
+          <w:sz w:val="28"/>
+          <w:szCs w:val="24"/>
+        </w:rPr>
+      </w:pPr>
+      <w:r>
+        <w:rPr>
+          <w:b/>
+          <w:bCs/>
+          <w:sz w:val="28"/>
+          <w:szCs w:val="24"/>
+        </w:rPr>
+        <w:t>Pre Coro</w:t>
+      </w:r>
+    </w:p>
+    <w:p>
+      <w:pPr>
+        <w:spacing w:after="0"/>
+        <w:rPr>
+          <w:b/>
+          <w:bCs/>
+          <w:sz w:val="28"/>
+          <w:szCs w:val="24"/>
+        </w:rPr>
+      </w:pPr>
+      <w:r>
+        <w:rPr>
+          <w:b/>
+          <w:bCs/>
+          <w:sz w:val="28"/>
+          <w:szCs w:val="24"/>
+        </w:rPr>
+        <w:t>//Coro//</w:t>
+      </w:r>
+    </w:p>
+    <w:p>
+      <w:pPr>
+        <w:spacing w:after="0"/>
+        <w:rPr>
+          <w:sz w:val="28"/>
+          <w:szCs w:val="24"/>
+        </w:rPr>
+      </w:pPr>
+      <w:r>
+        <w:rPr>
+          <w:b/>
+          <w:bCs/>
+          <w:sz w:val="28"/>
+          <w:szCs w:val="24"/>
+        </w:rPr>
+        <w:t>////Inter////:</w:t>
+      </w:r>
+      <w:r>
+        <w:rPr>
+          <w:b/>
+          <w:bCs/>
+          <w:sz w:val="28"/>
+          <w:szCs w:val="24"/>
+        </w:rPr>
+        <w:t xml:space="preserve"> </w:t>
+      </w:r>
+      <w:r>
+        <w:rPr>
+          <w:sz w:val="28"/>
+          <w:szCs w:val="24"/>
+        </w:rPr>
+        <w:t xml:space="preserve">F#m - A - D - A </w:t>
+      </w:r>
+      <w:r>
+        <w:rPr>
+          <w:sz w:val="28"/>
+          <w:szCs w:val="24"/>
+        </w:rPr>
+        <w:t>-</w:t>
+      </w:r>
+      <w:r>
+        <w:rPr>
+          <w:sz w:val="28"/>
+          <w:szCs w:val="24"/>
+        </w:rPr>
+        <w:t xml:space="preserve"> </w:t>
+      </w:r>
+      <w:r>
+        <w:rPr>
+          <w:sz w:val="28"/>
+          <w:szCs w:val="24"/>
+        </w:rPr>
+        <w:t>E/G#</w:t>
+      </w:r>
+    </w:p>
+    <w:p>
+      <w:pPr>
+        <w:spacing w:after="0"/>
+        <w:rPr>
+          <w:b/>
+          <w:bCs/>
+          <w:sz w:val="28"/>
+          <w:szCs w:val="24"/>
+        </w:rPr>
+      </w:pPr>
+    </w:p>
+    <w:p>
+      <w:pPr>
+        <w:spacing w:after="0"/>
+        <w:rPr>
+          <w:b/>
+          <w:bCs/>
+          <w:sz w:val="28"/>
+          <w:szCs w:val="24"/>
+        </w:rPr>
+      </w:pPr>
+    </w:p>
+    <w:p>
+      <w:pPr>
+        <w:spacing w:after="0"/>
+        <w:rPr>
+          <w:b/>
+          <w:bCs/>
+          <w:sz w:val="28"/>
+          <w:szCs w:val="24"/>
+        </w:rPr>
+      </w:pPr>
+    </w:p>
+    <w:p>
+      <w:pPr>
+        <w:spacing w:after="0"/>
+        <w:rPr>
+          <w:b/>
+          <w:bCs/>
+          <w:sz w:val="28"/>
+          <w:szCs w:val="24"/>
+        </w:rPr>
+      </w:pPr>
+      <w:r>
+        <w:rPr>
+          <w:b/>
+          <w:bCs/>
+          <w:sz w:val="28"/>
+          <w:szCs w:val="24"/>
+        </w:rPr>
+        <w:lastRenderedPageBreak/>
+        <w:t>////Puente////</w:t>
+      </w:r>
+    </w:p>
+    <w:p>
+      <w:pPr>
+        <w:spacing w:after="0"/>
+        <w:rPr>
+          <w:sz w:val="28"/>
+          <w:szCs w:val="24"/>
+        </w:rPr>
+      </w:pPr>
+      <w:r>
+        <w:rPr>
+          <w:sz w:val="28"/>
+          <w:szCs w:val="24"/>
+        </w:rPr>
+        <w:t>F#m</w:t>
+      </w:r>
+      <w:r>
+        <w:rPr>
+          <w:sz w:val="28"/>
+          <w:szCs w:val="24"/>
+        </w:rPr>
+        <w:t xml:space="preserve">     </w:t>
+      </w:r>
+      <w:r>
+        <w:rPr>
+          <w:sz w:val="28"/>
+          <w:szCs w:val="24"/>
+        </w:rPr>
+        <w:t xml:space="preserve">  </w:t>
+      </w:r>
+      <w:r>
+        <w:rPr>
+          <w:sz w:val="28"/>
+          <w:szCs w:val="24"/>
+        </w:rPr>
+        <w:t>A</w:t>
+      </w:r>
+      <w:r>
+        <w:rPr>
+          <w:sz w:val="28"/>
+          <w:szCs w:val="24"/>
+        </w:rPr>
+        <w:t xml:space="preserve">    </w:t>
+      </w:r>
+      <w:r>
+        <w:rPr>
+          <w:sz w:val="28"/>
+          <w:szCs w:val="24"/>
+        </w:rPr>
+        <w:t xml:space="preserve">        </w:t>
+      </w:r>
+    </w:p>
+    <w:p>
+      <w:pPr>
+        <w:spacing w:after="0"/>
+        <w:rPr>
+          <w:sz w:val="28"/>
+          <w:szCs w:val="24"/>
+        </w:rPr>
+      </w:pPr>
+      <w:r>
+        <w:rPr>
+          <w:sz w:val="28"/>
+          <w:szCs w:val="24"/>
+        </w:rPr>
+        <w:t xml:space="preserve">Santo y digno </w:t>
+      </w:r>
+    </w:p>
+    <w:p>
+      <w:pPr>
+        <w:spacing w:after="0"/>
+        <w:rPr>
+          <w:sz w:val="28"/>
+          <w:szCs w:val="24"/>
+        </w:rPr>
+      </w:pPr>
+      <w:r>
+        <w:rPr>
+          <w:sz w:val="28"/>
+          <w:szCs w:val="24"/>
+        </w:rPr>
+        <w:t xml:space="preserve">    </w:t>
+      </w:r>
+      <w:r>
+        <w:rPr>
+          <w:sz w:val="28"/>
+          <w:szCs w:val="24"/>
+        </w:rPr>
+        <w:t xml:space="preserve">D      </w:t>
+      </w:r>
+      <w:r>
+        <w:rPr>
+          <w:sz w:val="28"/>
+          <w:szCs w:val="24"/>
+        </w:rPr>
+        <w:t xml:space="preserve"> </w:t>
+      </w:r>
+      <w:proofErr w:type="gramStart"/>
+      <w:r>
+        <w:rPr>
+          <w:sz w:val="28"/>
+          <w:szCs w:val="24"/>
+        </w:rPr>
+        <w:t xml:space="preserve">A  </w:t>
+      </w:r>
+      <w:r>
+        <w:rPr>
+          <w:sz w:val="28"/>
+          <w:szCs w:val="24"/>
+        </w:rPr>
+        <w:t>E</w:t>
+      </w:r>
+      <w:proofErr w:type="gramEnd"/>
       <w:r>
         <w:rPr>
           <w:sz w:val="28"/>
@@ -823,65 +1202,109 @@
       <w:pPr>
         <w:spacing w:after="0"/>
         <w:rPr>
-          <w:b/>
-          <w:bCs/>
-          <w:sz w:val="28"/>
-          <w:szCs w:val="24"/>
-        </w:rPr>
-      </w:pPr>
-      <w:r>
-        <w:rPr>
-          <w:b/>
-          <w:bCs/>
-          <w:sz w:val="28"/>
-          <w:szCs w:val="24"/>
-        </w:rPr>
-        <w:t>Verso I</w:t>
-      </w:r>
-    </w:p>
-    <w:p>
-      <w:pPr>
-        <w:spacing w:after="0"/>
-        <w:rPr>
-          <w:b/>
-          <w:bCs/>
-          <w:sz w:val="28"/>
-          <w:szCs w:val="24"/>
-        </w:rPr>
-      </w:pPr>
-      <w:r>
-        <w:rPr>
-          <w:b/>
-          <w:bCs/>
-          <w:sz w:val="28"/>
-          <w:szCs w:val="24"/>
-        </w:rPr>
-        <w:t>Verso II</w:t>
-      </w:r>
-    </w:p>
-    <w:p>
-      <w:pPr>
-        <w:spacing w:after="0"/>
-        <w:rPr>
-          <w:b/>
-          <w:bCs/>
-          <w:sz w:val="28"/>
-          <w:szCs w:val="24"/>
-        </w:rPr>
-      </w:pPr>
-      <w:r>
-        <w:rPr>
-          <w:b/>
-          <w:bCs/>
-          <w:sz w:val="28"/>
-          <w:szCs w:val="24"/>
-        </w:rPr>
-        <w:t>Pre</w:t>
-      </w:r>
-      <w:r>
-        <w:rPr>
-          <w:b/>
-          <w:bCs/>
+          <w:sz w:val="28"/>
+          <w:szCs w:val="24"/>
+        </w:rPr>
+      </w:pPr>
+      <w:r>
+        <w:rPr>
+          <w:sz w:val="28"/>
+          <w:szCs w:val="24"/>
+        </w:rPr>
+        <w:t>es el cordero</w:t>
+      </w:r>
+    </w:p>
+    <w:p>
+      <w:pPr>
+        <w:spacing w:after="0"/>
+        <w:rPr>
+          <w:sz w:val="28"/>
+          <w:szCs w:val="24"/>
+        </w:rPr>
+      </w:pPr>
+      <w:r>
+        <w:rPr>
+          <w:sz w:val="28"/>
+          <w:szCs w:val="24"/>
+        </w:rPr>
+        <w:t>F#m</w:t>
+      </w:r>
+      <w:r>
+        <w:rPr>
+          <w:sz w:val="28"/>
+          <w:szCs w:val="24"/>
+        </w:rPr>
+        <w:t xml:space="preserve">  </w:t>
+      </w:r>
+      <w:r>
+        <w:rPr>
+          <w:sz w:val="28"/>
+          <w:szCs w:val="24"/>
+        </w:rPr>
+        <w:t xml:space="preserve">    </w:t>
+      </w:r>
+      <w:r>
+        <w:rPr>
+          <w:sz w:val="28"/>
+          <w:szCs w:val="24"/>
+        </w:rPr>
+        <w:t xml:space="preserve"> A    </w:t>
+      </w:r>
+      <w:r>
+        <w:rPr>
+          <w:sz w:val="28"/>
+          <w:szCs w:val="24"/>
+        </w:rPr>
+        <w:t xml:space="preserve">  </w:t>
+      </w:r>
+      <w:r>
+        <w:rPr>
+          <w:sz w:val="28"/>
+          <w:szCs w:val="24"/>
+        </w:rPr>
+        <w:t xml:space="preserve">   </w:t>
+      </w:r>
+    </w:p>
+    <w:p>
+      <w:pPr>
+        <w:spacing w:after="0"/>
+        <w:rPr>
+          <w:sz w:val="28"/>
+          <w:szCs w:val="24"/>
+        </w:rPr>
+      </w:pPr>
+      <w:r>
+        <w:rPr>
+          <w:sz w:val="28"/>
+          <w:szCs w:val="24"/>
+        </w:rPr>
+        <w:t>Que murió y</w:t>
+      </w:r>
+    </w:p>
+    <w:p>
+      <w:pPr>
+        <w:spacing w:after="0"/>
+        <w:rPr>
+          <w:sz w:val="28"/>
+          <w:szCs w:val="24"/>
+        </w:rPr>
+      </w:pPr>
+      <w:r>
+        <w:rPr>
+          <w:sz w:val="28"/>
+          <w:szCs w:val="24"/>
+        </w:rPr>
+        <w:t xml:space="preserve">    </w:t>
+      </w:r>
+      <w:r>
+        <w:rPr>
+          <w:sz w:val="28"/>
+          <w:szCs w:val="24"/>
+        </w:rPr>
+        <w:t xml:space="preserve">D   A  </w:t>
+      </w:r>
+      <w:r>
+        <w:rPr>
           <w:sz w:val="28"/>
           <w:szCs w:val="24"/>
         </w:rPr>
@@ -889,50 +1312,102 @@
       </w:r>
       <w:r>
         <w:rPr>
-          <w:b/>
-          <w:bCs/>
-          <w:sz w:val="28"/>
-          <w:szCs w:val="24"/>
-        </w:rPr>
-        <w:t>Coro</w:t>
-      </w:r>
-    </w:p>
-    <w:p>
-      <w:pPr>
-        <w:spacing w:after="0"/>
-        <w:rPr>
-          <w:b/>
-          <w:bCs/>
-          <w:sz w:val="28"/>
-          <w:szCs w:val="24"/>
-        </w:rPr>
-      </w:pPr>
-      <w:r>
-        <w:rPr>
-          <w:b/>
-          <w:bCs/>
-          <w:sz w:val="28"/>
-          <w:szCs w:val="24"/>
-        </w:rPr>
-        <w:t>//Coro//</w:t>
-      </w:r>
-    </w:p>
-    <w:p>
-      <w:pPr>
-        <w:spacing w:after="0"/>
-        <w:rPr>
-          <w:sz w:val="28"/>
-          <w:szCs w:val="24"/>
-        </w:rPr>
-      </w:pPr>
-      <w:r>
-        <w:rPr>
-          <w:b/>
-          <w:bCs/>
-          <w:sz w:val="28"/>
-          <w:szCs w:val="24"/>
-        </w:rPr>
-        <w:t xml:space="preserve">////Inter////: </w:t>
+          <w:sz w:val="28"/>
+          <w:szCs w:val="24"/>
+        </w:rPr>
+        <w:t>E/G#</w:t>
+      </w:r>
+    </w:p>
+    <w:p>
+      <w:pPr>
+        <w:spacing w:after="0"/>
+        <w:rPr>
+          <w:sz w:val="28"/>
+          <w:szCs w:val="24"/>
+        </w:rPr>
+      </w:pPr>
+      <w:r>
+        <w:rPr>
+          <w:sz w:val="28"/>
+          <w:szCs w:val="24"/>
+        </w:rPr>
+        <w:t>resucitó</w:t>
+      </w:r>
+    </w:p>
+    <w:p>
+      <w:pPr>
+        <w:spacing w:after="0"/>
+        <w:rPr>
+          <w:sz w:val="28"/>
+          <w:szCs w:val="24"/>
+        </w:rPr>
+      </w:pPr>
+    </w:p>
+    <w:p>
+      <w:pPr>
+        <w:spacing w:after="0"/>
+        <w:rPr>
+          <w:b/>
+          <w:bCs/>
+          <w:sz w:val="28"/>
+          <w:szCs w:val="24"/>
+        </w:rPr>
+      </w:pPr>
+      <w:r>
+        <w:rPr>
+          <w:b/>
+          <w:bCs/>
+          <w:sz w:val="28"/>
+          <w:szCs w:val="24"/>
+        </w:rPr>
+        <w:t>/////Coro/////</w:t>
+      </w:r>
+    </w:p>
+    <w:p>
+      <w:pPr>
+        <w:spacing w:after="0"/>
+        <w:rPr>
+          <w:b/>
+          <w:bCs/>
+          <w:sz w:val="28"/>
+          <w:szCs w:val="24"/>
+        </w:rPr>
+      </w:pPr>
+      <w:r>
+        <w:rPr>
+          <w:b/>
+          <w:bCs/>
+          <w:sz w:val="28"/>
+          <w:szCs w:val="24"/>
+        </w:rPr>
+        <w:t>Puente</w:t>
+      </w:r>
+    </w:p>
+    <w:p>
+      <w:pPr>
+        <w:spacing w:after="0"/>
+        <w:rPr>
+          <w:sz w:val="28"/>
+          <w:szCs w:val="24"/>
+        </w:rPr>
+      </w:pPr>
+      <w:r>
+        <w:rPr>
+          <w:b/>
+          <w:bCs/>
+          <w:sz w:val="28"/>
+          <w:szCs w:val="24"/>
+        </w:rPr>
+        <w:t>////Inter////:</w:t>
+      </w:r>
+      <w:r>
+        <w:rPr>
+          <w:b/>
+          <w:bCs/>
+          <w:sz w:val="28"/>
+          <w:szCs w:val="24"/>
+        </w:rPr>
+        <w:t xml:space="preserve"> </w:t>
       </w:r>
       <w:r>
         <w:rPr>
@@ -953,429 +1428,14 @@
           <w:sz w:val="28"/>
           <w:szCs w:val="24"/>
         </w:rPr>
-        <w:t xml:space="preserve"> E</w:t>
-      </w:r>
-      <w:r>
-        <w:rPr>
-          <w:sz w:val="28"/>
-          <w:szCs w:val="24"/>
-        </w:rPr>
-        <w:t>/G#</w:t>
-      </w:r>
-    </w:p>
-    <w:p>
-      <w:pPr>
-        <w:spacing w:after="0"/>
-        <w:rPr>
-          <w:b/>
-          <w:bCs/>
-          <w:sz w:val="28"/>
-          <w:szCs w:val="24"/>
-        </w:rPr>
-      </w:pPr>
-    </w:p>
-    <w:p>
-      <w:pPr>
-        <w:spacing w:after="0"/>
-        <w:rPr>
-          <w:b/>
-          <w:bCs/>
-          <w:sz w:val="28"/>
-          <w:szCs w:val="24"/>
-        </w:rPr>
-      </w:pPr>
-    </w:p>
-    <w:p>
-      <w:pPr>
-        <w:spacing w:after="0"/>
-        <w:rPr>
-          <w:b/>
-          <w:bCs/>
-          <w:sz w:val="28"/>
-          <w:szCs w:val="24"/>
-        </w:rPr>
-      </w:pPr>
-    </w:p>
-    <w:p>
-      <w:pPr>
-        <w:spacing w:after="0"/>
-        <w:rPr>
-          <w:b/>
-          <w:bCs/>
-          <w:sz w:val="28"/>
-          <w:szCs w:val="24"/>
-        </w:rPr>
-      </w:pPr>
-      <w:r>
-        <w:rPr>
-          <w:b/>
-          <w:bCs/>
-          <w:sz w:val="28"/>
-          <w:szCs w:val="24"/>
-        </w:rPr>
-        <w:lastRenderedPageBreak/>
-        <w:t>//</w:t>
-      </w:r>
-      <w:r>
-        <w:rPr>
-          <w:b/>
-          <w:bCs/>
-          <w:sz w:val="28"/>
-          <w:szCs w:val="24"/>
-        </w:rPr>
-        <w:t>//</w:t>
-      </w:r>
-      <w:r>
-        <w:rPr>
-          <w:b/>
-          <w:bCs/>
-          <w:sz w:val="28"/>
-          <w:szCs w:val="24"/>
-        </w:rPr>
-        <w:t>Puente</w:t>
-      </w:r>
-      <w:r>
-        <w:rPr>
-          <w:b/>
-          <w:bCs/>
-          <w:sz w:val="28"/>
-          <w:szCs w:val="24"/>
-        </w:rPr>
-        <w:t>//</w:t>
-      </w:r>
-      <w:r>
-        <w:rPr>
-          <w:b/>
-          <w:bCs/>
-          <w:sz w:val="28"/>
-          <w:szCs w:val="24"/>
-        </w:rPr>
-        <w:t>//</w:t>
-      </w:r>
-    </w:p>
-    <w:p>
-      <w:pPr>
-        <w:spacing w:after="0"/>
-        <w:rPr>
-          <w:sz w:val="28"/>
-          <w:szCs w:val="24"/>
-        </w:rPr>
-      </w:pPr>
-      <w:r>
-        <w:rPr>
-          <w:sz w:val="28"/>
-          <w:szCs w:val="24"/>
-        </w:rPr>
-        <w:t xml:space="preserve">F#m     </w:t>
-      </w:r>
-      <w:r>
-        <w:rPr>
-          <w:sz w:val="28"/>
-          <w:szCs w:val="24"/>
-        </w:rPr>
-        <w:t xml:space="preserve">  </w:t>
-      </w:r>
-      <w:r>
-        <w:rPr>
-          <w:sz w:val="28"/>
-          <w:szCs w:val="24"/>
-        </w:rPr>
-        <w:t>A</w:t>
-      </w:r>
-      <w:r>
-        <w:rPr>
-          <w:sz w:val="28"/>
-          <w:szCs w:val="24"/>
-        </w:rPr>
-        <w:t xml:space="preserve">    </w:t>
-      </w:r>
-      <w:r>
-        <w:rPr>
-          <w:sz w:val="28"/>
-          <w:szCs w:val="24"/>
-        </w:rPr>
-        <w:t xml:space="preserve">        </w:t>
-      </w:r>
-    </w:p>
-    <w:p>
-      <w:pPr>
-        <w:spacing w:after="0"/>
-        <w:rPr>
-          <w:sz w:val="28"/>
-          <w:szCs w:val="24"/>
-        </w:rPr>
-      </w:pPr>
-      <w:r>
-        <w:rPr>
-          <w:sz w:val="28"/>
-          <w:szCs w:val="24"/>
-        </w:rPr>
-        <w:t xml:space="preserve">Santo y digno </w:t>
-      </w:r>
-    </w:p>
-    <w:p>
-      <w:pPr>
-        <w:spacing w:after="0"/>
-        <w:rPr>
-          <w:sz w:val="28"/>
-          <w:szCs w:val="24"/>
-        </w:rPr>
-      </w:pPr>
-      <w:r>
-        <w:rPr>
-          <w:sz w:val="28"/>
-          <w:szCs w:val="24"/>
-        </w:rPr>
-        <w:t xml:space="preserve">    </w:t>
-      </w:r>
-      <w:r>
-        <w:rPr>
-          <w:sz w:val="28"/>
-          <w:szCs w:val="24"/>
-        </w:rPr>
-        <w:t xml:space="preserve">D       </w:t>
-      </w:r>
-      <w:proofErr w:type="gramStart"/>
-      <w:r>
-        <w:rPr>
-          <w:sz w:val="28"/>
-          <w:szCs w:val="24"/>
-        </w:rPr>
-        <w:t>A  E</w:t>
-      </w:r>
-      <w:proofErr w:type="gramEnd"/>
-      <w:r>
-        <w:rPr>
-          <w:sz w:val="28"/>
-          <w:szCs w:val="24"/>
-        </w:rPr>
-        <w:t>/G#</w:t>
-      </w:r>
-    </w:p>
-    <w:p>
-      <w:pPr>
-        <w:spacing w:after="0"/>
-        <w:rPr>
-          <w:sz w:val="28"/>
-          <w:szCs w:val="24"/>
-        </w:rPr>
-      </w:pPr>
-      <w:r>
-        <w:rPr>
-          <w:sz w:val="28"/>
-          <w:szCs w:val="24"/>
-        </w:rPr>
-        <w:t>es el cordero</w:t>
-      </w:r>
-    </w:p>
-    <w:p>
-      <w:pPr>
-        <w:spacing w:after="0"/>
-        <w:rPr>
-          <w:sz w:val="28"/>
-          <w:szCs w:val="24"/>
-        </w:rPr>
-      </w:pPr>
-      <w:r>
-        <w:rPr>
-          <w:sz w:val="28"/>
-          <w:szCs w:val="24"/>
-        </w:rPr>
-        <w:t xml:space="preserve">F#m  </w:t>
-      </w:r>
-      <w:r>
-        <w:rPr>
-          <w:sz w:val="28"/>
-          <w:szCs w:val="24"/>
-        </w:rPr>
-        <w:t xml:space="preserve">    </w:t>
-      </w:r>
-      <w:r>
-        <w:rPr>
-          <w:sz w:val="28"/>
-          <w:szCs w:val="24"/>
-        </w:rPr>
-        <w:t xml:space="preserve"> A    </w:t>
-      </w:r>
-      <w:r>
-        <w:rPr>
-          <w:sz w:val="28"/>
-          <w:szCs w:val="24"/>
-        </w:rPr>
-        <w:t xml:space="preserve">  </w:t>
-      </w:r>
-      <w:r>
-        <w:rPr>
-          <w:sz w:val="28"/>
-          <w:szCs w:val="24"/>
-        </w:rPr>
-        <w:t xml:space="preserve">   </w:t>
-      </w:r>
-    </w:p>
-    <w:p>
-      <w:pPr>
-        <w:spacing w:after="0"/>
-        <w:rPr>
-          <w:sz w:val="28"/>
-          <w:szCs w:val="24"/>
-        </w:rPr>
-      </w:pPr>
-      <w:r>
-        <w:rPr>
-          <w:sz w:val="28"/>
-          <w:szCs w:val="24"/>
-        </w:rPr>
-        <w:t>Que murió y</w:t>
-      </w:r>
-    </w:p>
-    <w:p>
-      <w:pPr>
-        <w:spacing w:after="0"/>
-        <w:rPr>
-          <w:sz w:val="28"/>
-          <w:szCs w:val="24"/>
-        </w:rPr>
-      </w:pPr>
-      <w:r>
-        <w:rPr>
-          <w:sz w:val="28"/>
-          <w:szCs w:val="24"/>
-        </w:rPr>
-        <w:t xml:space="preserve">    </w:t>
-      </w:r>
-      <w:r>
-        <w:rPr>
-          <w:sz w:val="28"/>
-          <w:szCs w:val="24"/>
-        </w:rPr>
-        <w:t xml:space="preserve">D   </w:t>
-      </w:r>
-      <w:proofErr w:type="gramStart"/>
-      <w:r>
-        <w:rPr>
-          <w:sz w:val="28"/>
-          <w:szCs w:val="24"/>
-        </w:rPr>
-        <w:t>A  E</w:t>
-      </w:r>
-      <w:proofErr w:type="gramEnd"/>
-      <w:r>
-        <w:rPr>
-          <w:sz w:val="28"/>
-          <w:szCs w:val="24"/>
-        </w:rPr>
-        <w:t>/G#</w:t>
-      </w:r>
-    </w:p>
-    <w:p>
-      <w:pPr>
-        <w:spacing w:after="0"/>
-        <w:rPr>
-          <w:sz w:val="28"/>
-          <w:szCs w:val="24"/>
-        </w:rPr>
-      </w:pPr>
-      <w:r>
-        <w:rPr>
-          <w:sz w:val="28"/>
-          <w:szCs w:val="24"/>
-        </w:rPr>
-        <w:t>resucitó</w:t>
-      </w:r>
-    </w:p>
-    <w:p>
-      <w:pPr>
-        <w:spacing w:after="0"/>
-        <w:rPr>
-          <w:sz w:val="28"/>
-          <w:szCs w:val="24"/>
-        </w:rPr>
-      </w:pPr>
-    </w:p>
-    <w:p>
-      <w:pPr>
-        <w:spacing w:after="0"/>
-        <w:rPr>
-          <w:b/>
-          <w:bCs/>
-          <w:sz w:val="28"/>
-          <w:szCs w:val="24"/>
-        </w:rPr>
-      </w:pPr>
-      <w:r>
-        <w:rPr>
-          <w:b/>
-          <w:bCs/>
-          <w:sz w:val="28"/>
-          <w:szCs w:val="24"/>
-        </w:rPr>
-        <w:t>/////Coro/////</w:t>
-      </w:r>
-    </w:p>
-    <w:p>
-      <w:pPr>
-        <w:spacing w:after="0"/>
-        <w:rPr>
-          <w:b/>
-          <w:bCs/>
-          <w:sz w:val="28"/>
-          <w:szCs w:val="24"/>
-        </w:rPr>
-      </w:pPr>
-      <w:r>
-        <w:rPr>
-          <w:b/>
-          <w:bCs/>
-          <w:sz w:val="28"/>
-          <w:szCs w:val="24"/>
-        </w:rPr>
-        <w:t>Puente</w:t>
-      </w:r>
-    </w:p>
-    <w:p>
-      <w:pPr>
-        <w:spacing w:after="0"/>
-        <w:rPr>
-          <w:sz w:val="28"/>
-          <w:szCs w:val="24"/>
-        </w:rPr>
-      </w:pPr>
-      <w:r>
-        <w:rPr>
-          <w:b/>
-          <w:bCs/>
-          <w:sz w:val="28"/>
-          <w:szCs w:val="24"/>
-        </w:rPr>
-        <w:t xml:space="preserve">////Inter////: </w:t>
-      </w:r>
-      <w:r>
-        <w:rPr>
-          <w:sz w:val="28"/>
-          <w:szCs w:val="24"/>
-        </w:rPr>
-        <w:t xml:space="preserve">F#m - A - D - A </w:t>
-      </w:r>
-      <w:r>
-        <w:rPr>
-          <w:sz w:val="28"/>
-          <w:szCs w:val="24"/>
-        </w:rPr>
-        <w:t>-</w:t>
-      </w:r>
-      <w:r>
-        <w:rPr>
-          <w:sz w:val="28"/>
-          <w:szCs w:val="24"/>
-        </w:rPr>
-        <w:t xml:space="preserve"> E</w:t>
-      </w:r>
-      <w:r>
-        <w:rPr>
-          <w:sz w:val="28"/>
-          <w:szCs w:val="24"/>
-        </w:rPr>
-        <w:t>/G#</w:t>
+        <w:t xml:space="preserve"> </w:t>
+      </w:r>
+      <w:r>
+        <w:rPr>
+          <w:sz w:val="28"/>
+          <w:szCs w:val="24"/>
+        </w:rPr>
+        <w:t>E/G#</w:t>
       </w:r>
     </w:p>
     <w:sectPr>
@@ -1827,7 +1887,6 @@
     <w:next w:val="Normal"/>
     <w:link w:val="Ttulo2Car"/>
     <w:uiPriority w:val="9"/>
-    <w:semiHidden/>
     <w:unhideWhenUsed/>
     <w:qFormat/>
     <w:rsid w:val="00945118"/>
@@ -1850,7 +1909,6 @@
     <w:next w:val="Normal"/>
     <w:link w:val="Ttulo3Car"/>
     <w:uiPriority w:val="9"/>
-    <w:semiHidden/>
     <w:unhideWhenUsed/>
     <w:qFormat/>
     <w:rsid w:val="00945118"/>
@@ -1873,7 +1931,6 @@
     <w:next w:val="Normal"/>
     <w:link w:val="Ttulo4Car"/>
     <w:uiPriority w:val="9"/>
-    <w:semiHidden/>
     <w:unhideWhenUsed/>
     <w:qFormat/>
     <w:rsid w:val="00945118"/>
@@ -2044,7 +2101,6 @@
     <w:basedOn w:val="Fuentedeprrafopredeter"/>
     <w:link w:val="Ttulo2"/>
     <w:uiPriority w:val="9"/>
-    <w:semiHidden/>
     <w:rsid w:val="00945118"/>
     <w:rPr>
       <w:rFonts w:asciiTheme="majorHAnsi" w:eastAsiaTheme="majorEastAsia" w:hAnsiTheme="majorHAnsi" w:cstheme="majorBidi"/>
@@ -2058,7 +2114,6 @@
     <w:basedOn w:val="Fuentedeprrafopredeter"/>
     <w:link w:val="Ttulo3"/>
     <w:uiPriority w:val="9"/>
-    <w:semiHidden/>
     <w:rsid w:val="00945118"/>
     <w:rPr>
       <w:rFonts w:eastAsiaTheme="majorEastAsia" w:cstheme="majorBidi"/>
@@ -2072,7 +2127,6 @@
     <w:basedOn w:val="Fuentedeprrafopredeter"/>
     <w:link w:val="Ttulo4"/>
     <w:uiPriority w:val="9"/>
-    <w:semiHidden/>
     <w:rsid w:val="00945118"/>
     <w:rPr>
       <w:rFonts w:eastAsiaTheme="majorEastAsia" w:cstheme="majorBidi"/>
@@ -2324,6 +2378,73 @@
       <w:smallCaps/>
       <w:color w:val="0F4761" w:themeColor="accent1" w:themeShade="BF"/>
       <w:spacing w:val="5"/>
+    </w:rPr>
+  </w:style>
+  <w:style w:type="paragraph" w:styleId="Lista">
+    <w:name w:val="List"/>
+    <w:basedOn w:val="Normal"/>
+    <w:uiPriority w:val="99"/>
+    <w:unhideWhenUsed/>
+    <w:rsid w:val="008008A6"/>
+    <w:pPr>
+      <w:ind w:left="283" w:hanging="283"/>
+      <w:contextualSpacing/>
+    </w:pPr>
+  </w:style>
+  <w:style w:type="paragraph" w:styleId="Textoindependiente">
+    <w:name w:val="Body Text"/>
+    <w:basedOn w:val="Normal"/>
+    <w:link w:val="TextoindependienteCar"/>
+    <w:uiPriority w:val="99"/>
+    <w:unhideWhenUsed/>
+    <w:rsid w:val="008008A6"/>
+    <w:pPr>
+      <w:spacing w:after="120"/>
+    </w:pPr>
+  </w:style>
+  <w:style w:type="character" w:customStyle="1" w:styleId="TextoindependienteCar">
+    <w:name w:val="Texto independiente Car"/>
+    <w:basedOn w:val="Fuentedeprrafopredeter"/>
+    <w:link w:val="Textoindependiente"/>
+    <w:uiPriority w:val="99"/>
+    <w:rsid w:val="008008A6"/>
+    <w:rPr>
+      <w:rFonts w:ascii="Arial" w:hAnsi="Arial"/>
+      <w:sz w:val="24"/>
+    </w:rPr>
+  </w:style>
+  <w:style w:type="paragraph" w:styleId="Sangranormal">
+    <w:name w:val="Normal Indent"/>
+    <w:basedOn w:val="Normal"/>
+    <w:uiPriority w:val="99"/>
+    <w:semiHidden/>
+    <w:unhideWhenUsed/>
+    <w:rsid w:val="008008A6"/>
+    <w:pPr>
+      <w:ind w:left="708"/>
+    </w:pPr>
+  </w:style>
+  <w:style w:type="paragraph" w:styleId="Textoindependienteprimerasangra">
+    <w:name w:val="Body Text First Indent"/>
+    <w:basedOn w:val="Textoindependiente"/>
+    <w:link w:val="TextoindependienteprimerasangraCar"/>
+    <w:uiPriority w:val="99"/>
+    <w:unhideWhenUsed/>
+    <w:rsid w:val="008008A6"/>
+    <w:pPr>
+      <w:spacing w:after="160"/>
+      <w:ind w:firstLine="360"/>
+    </w:pPr>
+  </w:style>
+  <w:style w:type="character" w:customStyle="1" w:styleId="TextoindependienteprimerasangraCar">
+    <w:name w:val="Texto independiente primera sangría Car"/>
+    <w:basedOn w:val="TextoindependienteCar"/>
+    <w:link w:val="Textoindependienteprimerasangra"/>
+    <w:uiPriority w:val="99"/>
+    <w:rsid w:val="008008A6"/>
+    <w:rPr>
+      <w:rFonts w:ascii="Arial" w:hAnsi="Arial"/>
+      <w:sz w:val="24"/>
     </w:rPr>
   </w:style>
 </w:styles>

</xml_diff>